<commit_message>
Added Github Repository link
Added Github Repository link
</commit_message>
<xml_diff>
--- a/Team4_The_Zen_Of_File_File_Index.docx
+++ b/Team4_The_Zen_Of_File_File_Index.docx
@@ -19,7 +19,7 @@
           <w:sz w:val="28"/>
           <w:szCs w:val="28"/>
         </w:rPr>
-        <w:t>F</w:t>
+        <w:t xml:space="preserve">Github </w:t>
       </w:r>
       <w:r>
         <w:rPr>
@@ -28,7 +28,16 @@
           <w:sz w:val="28"/>
           <w:szCs w:val="28"/>
         </w:rPr>
-        <w:t>ile Index:</w:t>
+        <w:t>R</w:t>
+      </w:r>
+      <w:r>
+        <w:rPr>
+          <w:b/>
+          <w:bCs/>
+          <w:sz w:val="28"/>
+          <w:szCs w:val="28"/>
+        </w:rPr>
+        <w:t>epository:</w:t>
       </w:r>
     </w:p>
     <w:p>
@@ -39,112 +48,61 @@
           <w:szCs w:val="28"/>
         </w:rPr>
       </w:pPr>
-      <w:r>
-        <w:rPr>
-          <w:sz w:val="28"/>
-          <w:szCs w:val="28"/>
-        </w:rPr>
-        <w:t xml:space="preserve">Category </w:t>
-      </w:r>
-      <w:proofErr w:type="gramStart"/>
-      <w:r>
-        <w:rPr>
-          <w:sz w:val="28"/>
-          <w:szCs w:val="28"/>
-        </w:rPr>
-        <w:t>1.</w:t>
-      </w:r>
-      <w:r>
-        <w:rPr>
-          <w:sz w:val="28"/>
-          <w:szCs w:val="28"/>
-        </w:rPr>
-        <w:t>Team</w:t>
-      </w:r>
-      <w:proofErr w:type="gramEnd"/>
-      <w:r>
-        <w:rPr>
-          <w:sz w:val="28"/>
-          <w:szCs w:val="28"/>
-        </w:rPr>
-        <w:t>4_The_Zen_Of_Five_</w:t>
-      </w:r>
-      <w:proofErr w:type="gramStart"/>
-      <w:r>
-        <w:rPr>
-          <w:sz w:val="28"/>
-          <w:szCs w:val="28"/>
-        </w:rPr>
-        <w:t>01.Data</w:t>
-      </w:r>
-      <w:r>
-        <w:rPr>
-          <w:sz w:val="28"/>
-          <w:szCs w:val="28"/>
-        </w:rPr>
-        <w:t>Cleaning.ipynb</w:t>
-      </w:r>
-      <w:proofErr w:type="gramEnd"/>
-      <w:r>
-        <w:rPr>
-          <w:sz w:val="28"/>
-          <w:szCs w:val="28"/>
-        </w:rPr>
-        <w:t xml:space="preserve">  </w:t>
-      </w:r>
+      <w:hyperlink r:id="rId5" w:history="1">
+        <w:r>
+          <w:rPr>
+            <w:rStyle w:val="Hyperlink"/>
+            <w:sz w:val="28"/>
+            <w:szCs w:val="28"/>
+          </w:rPr>
+          <w:t>https://github.com/mishrasudha1984</w:t>
+        </w:r>
+        <w:r>
+          <w:rPr>
+            <w:rStyle w:val="Hyperlink"/>
+            <w:sz w:val="28"/>
+            <w:szCs w:val="28"/>
+          </w:rPr>
+          <w:t>-</w:t>
+        </w:r>
+        <w:r>
+          <w:rPr>
+            <w:rStyle w:val="Hyperlink"/>
+            <w:sz w:val="28"/>
+            <w:szCs w:val="28"/>
+          </w:rPr>
+          <w:t>png/Team4_The_Zen_OF_Five_PythonHackathon_Sep2026</w:t>
+        </w:r>
+      </w:hyperlink>
     </w:p>
     <w:p>
       <w:pPr>
         <w:jc w:val="both"/>
         <w:rPr>
+          <w:b/>
+          <w:bCs/>
           <w:sz w:val="28"/>
           <w:szCs w:val="28"/>
         </w:rPr>
       </w:pPr>
       <w:r>
         <w:rPr>
-          <w:sz w:val="28"/>
-          <w:szCs w:val="28"/>
-        </w:rPr>
-        <w:t xml:space="preserve">Category </w:t>
-      </w:r>
-      <w:r>
-        <w:rPr>
-          <w:sz w:val="28"/>
-          <w:szCs w:val="28"/>
-        </w:rPr>
-        <w:t>2.</w:t>
-      </w:r>
-      <w:r>
-        <w:rPr>
-          <w:sz w:val="28"/>
-          <w:szCs w:val="28"/>
-        </w:rPr>
-        <w:t xml:space="preserve"> </w:t>
-      </w:r>
-      <w:r>
-        <w:rPr>
-          <w:sz w:val="28"/>
-          <w:szCs w:val="28"/>
-        </w:rPr>
-        <w:t>Team4_The_Zen_Of_Five_</w:t>
-      </w:r>
-      <w:proofErr w:type="gramStart"/>
-      <w:r>
-        <w:rPr>
-          <w:sz w:val="28"/>
-          <w:szCs w:val="28"/>
-        </w:rPr>
-        <w:t>02.</w:t>
-      </w:r>
-      <w:r>
-        <w:rPr>
-          <w:sz w:val="28"/>
-          <w:szCs w:val="28"/>
-        </w:rPr>
-        <w:t>Descriptive.ipynb</w:t>
-      </w:r>
-      <w:proofErr w:type="gramEnd"/>
+          <w:b/>
+          <w:bCs/>
+          <w:sz w:val="28"/>
+          <w:szCs w:val="28"/>
+        </w:rPr>
+        <w:t>F</w:t>
+      </w:r>
+      <w:r>
+        <w:rPr>
+          <w:b/>
+          <w:bCs/>
+          <w:sz w:val="28"/>
+          <w:szCs w:val="28"/>
+        </w:rPr>
+        <w:t>ile Index:</w:t>
+      </w:r>
     </w:p>
     <w:p>
       <w:pPr>
@@ -161,52 +119,41 @@
         </w:rPr>
         <w:t xml:space="preserve">Category </w:t>
       </w:r>
-      <w:proofErr w:type="gramStart"/>
-      <w:r>
-        <w:rPr>
-          <w:sz w:val="28"/>
-          <w:szCs w:val="28"/>
-        </w:rPr>
-        <w:t>3</w:t>
-      </w:r>
-      <w:r>
-        <w:rPr>
-          <w:sz w:val="28"/>
-          <w:szCs w:val="28"/>
-        </w:rPr>
-        <w:t>.</w:t>
-      </w:r>
-      <w:r>
-        <w:rPr>
-          <w:sz w:val="28"/>
-          <w:szCs w:val="28"/>
-        </w:rPr>
-        <w:t>Team</w:t>
-      </w:r>
-      <w:proofErr w:type="gramEnd"/>
-      <w:r>
-        <w:rPr>
-          <w:sz w:val="28"/>
-          <w:szCs w:val="28"/>
-        </w:rPr>
-        <w:t>4_The_Zen_Of_Five_</w:t>
-      </w:r>
-      <w:proofErr w:type="gramStart"/>
-      <w:r>
-        <w:rPr>
-          <w:sz w:val="28"/>
-          <w:szCs w:val="28"/>
-        </w:rPr>
-        <w:t>03.</w:t>
-      </w:r>
-      <w:r>
-        <w:rPr>
-          <w:sz w:val="28"/>
-          <w:szCs w:val="28"/>
-        </w:rPr>
-        <w:t>Prescriptive.ipynb</w:t>
-      </w:r>
-      <w:proofErr w:type="gramEnd"/>
+      <w:r>
+        <w:rPr>
+          <w:sz w:val="28"/>
+          <w:szCs w:val="28"/>
+        </w:rPr>
+        <w:t>1.</w:t>
+      </w:r>
+      <w:r>
+        <w:rPr>
+          <w:sz w:val="28"/>
+          <w:szCs w:val="28"/>
+        </w:rPr>
+        <w:t>Team4_The_Zen_Of_Five_</w:t>
+      </w:r>
+      <w:r>
+        <w:rPr>
+          <w:sz w:val="28"/>
+          <w:szCs w:val="28"/>
+        </w:rPr>
+        <w:t>01</w:t>
+      </w:r>
+      <w:r>
+        <w:rPr>
+          <w:sz w:val="28"/>
+          <w:szCs w:val="28"/>
+        </w:rPr>
+        <w:t>.Data</w:t>
+      </w:r>
+      <w:r>
+        <w:rPr>
+          <w:sz w:val="28"/>
+          <w:szCs w:val="28"/>
+        </w:rPr>
+        <w:t xml:space="preserve">Cleaning.ipynb  </w:t>
+      </w:r>
     </w:p>
     <w:p>
       <w:pPr>
@@ -223,52 +170,41 @@
         </w:rPr>
         <w:t xml:space="preserve">Category </w:t>
       </w:r>
-      <w:proofErr w:type="gramStart"/>
-      <w:r>
-        <w:rPr>
-          <w:sz w:val="28"/>
-          <w:szCs w:val="28"/>
-        </w:rPr>
-        <w:t>4</w:t>
-      </w:r>
-      <w:r>
-        <w:rPr>
-          <w:sz w:val="28"/>
-          <w:szCs w:val="28"/>
-        </w:rPr>
-        <w:t>.</w:t>
-      </w:r>
-      <w:r>
-        <w:rPr>
-          <w:sz w:val="28"/>
-          <w:szCs w:val="28"/>
-        </w:rPr>
-        <w:t>Team</w:t>
-      </w:r>
-      <w:proofErr w:type="gramEnd"/>
-      <w:r>
-        <w:rPr>
-          <w:sz w:val="28"/>
-          <w:szCs w:val="28"/>
-        </w:rPr>
-        <w:t>4_The_Zen_Of_Five_</w:t>
-      </w:r>
-      <w:proofErr w:type="gramStart"/>
-      <w:r>
-        <w:rPr>
-          <w:sz w:val="28"/>
-          <w:szCs w:val="28"/>
-        </w:rPr>
-        <w:t>04.</w:t>
-      </w:r>
-      <w:r>
-        <w:rPr>
-          <w:sz w:val="28"/>
-          <w:szCs w:val="28"/>
-        </w:rPr>
-        <w:t>Predictive.ipynb</w:t>
-      </w:r>
-      <w:proofErr w:type="gramEnd"/>
+      <w:r>
+        <w:rPr>
+          <w:sz w:val="28"/>
+          <w:szCs w:val="28"/>
+        </w:rPr>
+        <w:t>2.</w:t>
+      </w:r>
+      <w:r>
+        <w:rPr>
+          <w:sz w:val="28"/>
+          <w:szCs w:val="28"/>
+        </w:rPr>
+        <w:t xml:space="preserve"> </w:t>
+      </w:r>
+      <w:r>
+        <w:rPr>
+          <w:sz w:val="28"/>
+          <w:szCs w:val="28"/>
+        </w:rPr>
+        <w:t>Team4_The_Zen_Of_Five_</w:t>
+      </w:r>
+      <w:r>
+        <w:rPr>
+          <w:sz w:val="28"/>
+          <w:szCs w:val="28"/>
+        </w:rPr>
+        <w:t>02.</w:t>
+      </w:r>
+      <w:r>
+        <w:rPr>
+          <w:sz w:val="28"/>
+          <w:szCs w:val="28"/>
+        </w:rPr>
+        <w:t>Descriptive.ipynb</w:t>
+      </w:r>
     </w:p>
     <w:p>
       <w:pPr>
@@ -290,7 +226,7 @@
           <w:sz w:val="28"/>
           <w:szCs w:val="28"/>
         </w:rPr>
-        <w:t>5</w:t>
+        <w:t>3</w:t>
       </w:r>
       <w:r>
         <w:rPr>
@@ -304,35 +240,21 @@
           <w:sz w:val="28"/>
           <w:szCs w:val="28"/>
         </w:rPr>
-        <w:t xml:space="preserve"> </w:t>
-      </w:r>
-      <w:r>
-        <w:rPr>
-          <w:sz w:val="28"/>
-          <w:szCs w:val="28"/>
-        </w:rPr>
-        <w:t>Team4_The_Zen_Of_Five_05.</w:t>
-      </w:r>
-      <w:r>
-        <w:rPr>
-          <w:sz w:val="28"/>
-          <w:szCs w:val="28"/>
-        </w:rPr>
-        <w:t>Dashboard</w:t>
-      </w:r>
-      <w:r>
-        <w:rPr>
-          <w:sz w:val="28"/>
-          <w:szCs w:val="28"/>
-        </w:rPr>
-        <w:t>.py</w:t>
-      </w:r>
-      <w:r>
-        <w:rPr>
-          <w:sz w:val="28"/>
-          <w:szCs w:val="28"/>
-        </w:rPr>
-        <w:t xml:space="preserve"> </w:t>
+        <w:t>Team4_The_Zen_Of_Five_</w:t>
+      </w:r>
+      <w:r>
+        <w:rPr>
+          <w:sz w:val="28"/>
+          <w:szCs w:val="28"/>
+        </w:rPr>
+        <w:t>03.</w:t>
+      </w:r>
+      <w:r>
+        <w:rPr>
+          <w:sz w:val="28"/>
+          <w:szCs w:val="28"/>
+        </w:rPr>
+        <w:t>Prescriptive.ipynb</w:t>
       </w:r>
     </w:p>
     <w:p>
@@ -348,44 +270,14 @@
           <w:sz w:val="28"/>
           <w:szCs w:val="28"/>
         </w:rPr>
-        <w:t xml:space="preserve">This is the </w:t>
-      </w:r>
-      <w:proofErr w:type="spellStart"/>
-      <w:r>
-        <w:rPr>
-          <w:sz w:val="28"/>
-          <w:szCs w:val="28"/>
-        </w:rPr>
-        <w:t>plotly</w:t>
-      </w:r>
-      <w:proofErr w:type="spellEnd"/>
-      <w:r>
-        <w:rPr>
-          <w:sz w:val="28"/>
-          <w:szCs w:val="28"/>
-        </w:rPr>
-        <w:t>/</w:t>
-      </w:r>
-      <w:r>
-        <w:rPr>
-          <w:sz w:val="28"/>
-          <w:szCs w:val="28"/>
-        </w:rPr>
-        <w:t>stream lit dashboard. Please run from local c</w:t>
-      </w:r>
-      <w:r>
-        <w:rPr>
-          <w:sz w:val="28"/>
-          <w:szCs w:val="28"/>
-        </w:rPr>
-        <w:t>omman</w:t>
-      </w:r>
-      <w:r>
-        <w:rPr>
-          <w:sz w:val="28"/>
-          <w:szCs w:val="28"/>
-        </w:rPr>
-        <w:t>d prompt</w:t>
+        <w:t xml:space="preserve">Category </w:t>
+      </w:r>
+      <w:r>
+        <w:rPr>
+          <w:sz w:val="28"/>
+          <w:szCs w:val="28"/>
+        </w:rPr>
+        <w:t>4</w:t>
       </w:r>
       <w:r>
         <w:rPr>
@@ -393,6 +285,27 @@
           <w:szCs w:val="28"/>
         </w:rPr>
         <w:t>.</w:t>
+      </w:r>
+      <w:r>
+        <w:rPr>
+          <w:sz w:val="28"/>
+          <w:szCs w:val="28"/>
+        </w:rPr>
+        <w:t>Team4_The_Zen_Of_Five_</w:t>
+      </w:r>
+      <w:r>
+        <w:rPr>
+          <w:sz w:val="28"/>
+          <w:szCs w:val="28"/>
+        </w:rPr>
+        <w:t>04.</w:t>
+      </w:r>
+      <w:r>
+        <w:rPr>
+          <w:sz w:val="28"/>
+          <w:szCs w:val="28"/>
+        </w:rPr>
+        <w:t>Predictive.ipynb</w:t>
       </w:r>
     </w:p>
     <w:p>
@@ -408,21 +321,164 @@
           <w:sz w:val="28"/>
           <w:szCs w:val="28"/>
         </w:rPr>
-        <w:t>Seven</w:t>
-      </w:r>
-      <w:r>
-        <w:rPr>
-          <w:sz w:val="28"/>
-          <w:szCs w:val="28"/>
-        </w:rPr>
-        <w:t xml:space="preserve"> Raw source </w:t>
-      </w:r>
-      <w:r>
-        <w:rPr>
-          <w:sz w:val="28"/>
-          <w:szCs w:val="28"/>
-        </w:rPr>
-        <w:t xml:space="preserve">file </w:t>
+        <w:t xml:space="preserve">Category </w:t>
+      </w:r>
+      <w:r>
+        <w:rPr>
+          <w:sz w:val="28"/>
+          <w:szCs w:val="28"/>
+        </w:rPr>
+        <w:t>5</w:t>
+      </w:r>
+      <w:r>
+        <w:rPr>
+          <w:sz w:val="28"/>
+          <w:szCs w:val="28"/>
+        </w:rPr>
+        <w:t>.</w:t>
+      </w:r>
+      <w:r>
+        <w:rPr>
+          <w:sz w:val="28"/>
+          <w:szCs w:val="28"/>
+        </w:rPr>
+        <w:t xml:space="preserve"> </w:t>
+      </w:r>
+      <w:r>
+        <w:rPr>
+          <w:sz w:val="28"/>
+          <w:szCs w:val="28"/>
+        </w:rPr>
+        <w:t>Team4_The_Zen_Of_Five_</w:t>
+      </w:r>
+      <w:r>
+        <w:rPr>
+          <w:sz w:val="28"/>
+          <w:szCs w:val="28"/>
+        </w:rPr>
+        <w:t>05.</w:t>
+      </w:r>
+      <w:r>
+        <w:rPr>
+          <w:sz w:val="28"/>
+          <w:szCs w:val="28"/>
+        </w:rPr>
+        <w:t>Dashboard</w:t>
+      </w:r>
+      <w:r>
+        <w:rPr>
+          <w:sz w:val="28"/>
+          <w:szCs w:val="28"/>
+        </w:rPr>
+        <w:t>.py</w:t>
+      </w:r>
+      <w:r>
+        <w:rPr>
+          <w:sz w:val="28"/>
+          <w:szCs w:val="28"/>
+        </w:rPr>
+        <w:t xml:space="preserve"> </w:t>
+      </w:r>
+    </w:p>
+    <w:p>
+      <w:pPr>
+        <w:jc w:val="both"/>
+        <w:rPr>
+          <w:sz w:val="28"/>
+          <w:szCs w:val="28"/>
+        </w:rPr>
+      </w:pPr>
+      <w:r>
+        <w:rPr>
+          <w:sz w:val="28"/>
+          <w:szCs w:val="28"/>
+        </w:rPr>
+        <w:t xml:space="preserve">This is the </w:t>
+      </w:r>
+      <w:proofErr w:type="spellStart"/>
+      <w:r>
+        <w:rPr>
+          <w:sz w:val="28"/>
+          <w:szCs w:val="28"/>
+        </w:rPr>
+        <w:t>plotly</w:t>
+      </w:r>
+      <w:proofErr w:type="spellEnd"/>
+      <w:r>
+        <w:rPr>
+          <w:sz w:val="28"/>
+          <w:szCs w:val="28"/>
+        </w:rPr>
+        <w:t>/</w:t>
+      </w:r>
+      <w:r>
+        <w:rPr>
+          <w:sz w:val="28"/>
+          <w:szCs w:val="28"/>
+        </w:rPr>
+        <w:t>stream lit dashboard. Please run from local c</w:t>
+      </w:r>
+      <w:r>
+        <w:rPr>
+          <w:sz w:val="28"/>
+          <w:szCs w:val="28"/>
+        </w:rPr>
+        <w:t>omman</w:t>
+      </w:r>
+      <w:r>
+        <w:rPr>
+          <w:sz w:val="28"/>
+          <w:szCs w:val="28"/>
+        </w:rPr>
+        <w:t>d prompt</w:t>
+      </w:r>
+      <w:r>
+        <w:rPr>
+          <w:sz w:val="28"/>
+          <w:szCs w:val="28"/>
+        </w:rPr>
+        <w:t>.</w:t>
+      </w:r>
+      <w:r>
+        <w:rPr>
+          <w:sz w:val="28"/>
+          <w:szCs w:val="28"/>
+        </w:rPr>
+        <w:t xml:space="preserve"> </w:t>
+      </w:r>
+    </w:p>
+    <w:p>
+      <w:pPr>
+        <w:jc w:val="both"/>
+        <w:rPr>
+          <w:sz w:val="28"/>
+          <w:szCs w:val="28"/>
+        </w:rPr>
+      </w:pPr>
+      <w:r>
+        <w:rPr>
+          <w:b/>
+          <w:bCs/>
+          <w:sz w:val="28"/>
+          <w:szCs w:val="28"/>
+        </w:rPr>
+        <w:t xml:space="preserve">Raw source </w:t>
+      </w:r>
+      <w:r>
+        <w:rPr>
+          <w:b/>
+          <w:bCs/>
+          <w:sz w:val="28"/>
+          <w:szCs w:val="28"/>
+        </w:rPr>
+        <w:t>file</w:t>
+      </w:r>
+      <w:r>
+        <w:rPr>
+          <w:sz w:val="28"/>
+          <w:szCs w:val="28"/>
+        </w:rPr>
+        <w:t xml:space="preserve"> </w:t>
       </w:r>
       <w:r>
         <w:rPr>
@@ -476,57 +532,57 @@
             <o:lock v:ext="edit" aspectratio="t"/>
           </v:shapetype>
           <v:shape id="_x0000_i1025" type="#_x0000_t75" style="width:75.5pt;height:49pt" o:ole="">
-            <v:imagedata r:id="rId5" o:title=""/>
+            <v:imagedata r:id="rId6" o:title=""/>
           </v:shape>
-          <o:OLEObject Type="Embed" ProgID="Excel.SheetMacroEnabled.12" ShapeID="_x0000_i1025" DrawAspect="Icon" ObjectID="_1852143265" r:id="rId6"/>
+          <o:OLEObject Type="Embed" ProgID="Excel.SheetMacroEnabled.12" ShapeID="_x0000_i1025" DrawAspect="Icon" ObjectID="_1852189939" r:id="rId7"/>
         </w:object>
       </w:r>
       <w:r>
         <w:object w:dxaOrig="1508" w:dyaOrig="983" w14:anchorId="462167B3">
           <v:shape id="_x0000_i1026" type="#_x0000_t75" style="width:75.5pt;height:49pt" o:ole="">
-            <v:imagedata r:id="rId7" o:title=""/>
+            <v:imagedata r:id="rId8" o:title=""/>
           </v:shape>
-          <o:OLEObject Type="Embed" ProgID="Excel.SheetMacroEnabled.12" ShapeID="_x0000_i1026" DrawAspect="Icon" ObjectID="_1852143266" r:id="rId8"/>
+          <o:OLEObject Type="Embed" ProgID="Excel.SheetMacroEnabled.12" ShapeID="_x0000_i1026" DrawAspect="Icon" ObjectID="_1852189940" r:id="rId9"/>
         </w:object>
       </w:r>
       <w:r>
         <w:object w:dxaOrig="1508" w:dyaOrig="983" w14:anchorId="0A940FC7">
           <v:shape id="_x0000_i1027" type="#_x0000_t75" style="width:75.5pt;height:49pt" o:ole="">
-            <v:imagedata r:id="rId9" o:title=""/>
+            <v:imagedata r:id="rId10" o:title=""/>
           </v:shape>
-          <o:OLEObject Type="Embed" ProgID="Excel.SheetMacroEnabled.12" ShapeID="_x0000_i1027" DrawAspect="Icon" ObjectID="_1852143267" r:id="rId10"/>
+          <o:OLEObject Type="Embed" ProgID="Excel.SheetMacroEnabled.12" ShapeID="_x0000_i1027" DrawAspect="Icon" ObjectID="_1852189941" r:id="rId11"/>
         </w:object>
       </w:r>
       <w:r>
         <w:object w:dxaOrig="1508" w:dyaOrig="983" w14:anchorId="6D2DFF49">
           <v:shape id="_x0000_i1028" type="#_x0000_t75" style="width:75.5pt;height:49pt" o:ole="">
-            <v:imagedata r:id="rId11" o:title=""/>
+            <v:imagedata r:id="rId12" o:title=""/>
           </v:shape>
-          <o:OLEObject Type="Embed" ProgID="Excel.SheetMacroEnabled.12" ShapeID="_x0000_i1028" DrawAspect="Icon" ObjectID="_1852143268" r:id="rId12"/>
+          <o:OLEObject Type="Embed" ProgID="Excel.SheetMacroEnabled.12" ShapeID="_x0000_i1028" DrawAspect="Icon" ObjectID="_1852189942" r:id="rId13"/>
         </w:object>
       </w:r>
       <w:r>
         <w:object w:dxaOrig="1508" w:dyaOrig="983" w14:anchorId="18A783FD">
           <v:shape id="_x0000_i1029" type="#_x0000_t75" style="width:75.5pt;height:49pt" o:ole="">
-            <v:imagedata r:id="rId13" o:title=""/>
+            <v:imagedata r:id="rId14" o:title=""/>
           </v:shape>
-          <o:OLEObject Type="Embed" ProgID="Excel.SheetMacroEnabled.12" ShapeID="_x0000_i1029" DrawAspect="Icon" ObjectID="_1852143269" r:id="rId14"/>
+          <o:OLEObject Type="Embed" ProgID="Excel.SheetMacroEnabled.12" ShapeID="_x0000_i1029" DrawAspect="Icon" ObjectID="_1852189943" r:id="rId15"/>
         </w:object>
       </w:r>
       <w:r>
         <w:object w:dxaOrig="1508" w:dyaOrig="983" w14:anchorId="6D7F4D1C">
           <v:shape id="_x0000_i1030" type="#_x0000_t75" style="width:75.5pt;height:49pt" o:ole="">
-            <v:imagedata r:id="rId15" o:title=""/>
+            <v:imagedata r:id="rId16" o:title=""/>
           </v:shape>
-          <o:OLEObject Type="Embed" ProgID="Excel.SheetMacroEnabled.12" ShapeID="_x0000_i1030" DrawAspect="Icon" ObjectID="_1852143270" r:id="rId16"/>
+          <o:OLEObject Type="Embed" ProgID="Excel.SheetMacroEnabled.12" ShapeID="_x0000_i1030" DrawAspect="Icon" ObjectID="_1852189944" r:id="rId17"/>
         </w:object>
       </w:r>
       <w:r>
         <w:object w:dxaOrig="1508" w:dyaOrig="983" w14:anchorId="47BE20F6">
           <v:shape id="_x0000_i1031" type="#_x0000_t75" style="width:75.5pt;height:49pt" o:ole="">
-            <v:imagedata r:id="rId17" o:title=""/>
+            <v:imagedata r:id="rId18" o:title=""/>
           </v:shape>
-          <o:OLEObject Type="Embed" ProgID="Excel.SheetMacroEnabled.12" ShapeID="_x0000_i1031" DrawAspect="Icon" ObjectID="_1852143271" r:id="rId18"/>
+          <o:OLEObject Type="Embed" ProgID="Excel.SheetMacroEnabled.12" ShapeID="_x0000_i1031" DrawAspect="Icon" ObjectID="_1852189945" r:id="rId19"/>
         </w:object>
       </w:r>
     </w:p>
@@ -638,9 +694,9 @@
         </w:rPr>
         <w:object w:dxaOrig="1508" w:dyaOrig="983" w14:anchorId="6773028A">
           <v:shape id="_x0000_i1032" type="#_x0000_t75" style="width:75.5pt;height:49pt" o:ole="">
-            <v:imagedata r:id="rId19" o:title=""/>
+            <v:imagedata r:id="rId20" o:title=""/>
           </v:shape>
-          <o:OLEObject Type="Embed" ProgID="Excel.SheetMacroEnabled.12" ShapeID="_x0000_i1032" DrawAspect="Icon" ObjectID="_1852143272" r:id="rId20"/>
+          <o:OLEObject Type="Embed" ProgID="Excel.SheetMacroEnabled.12" ShapeID="_x0000_i1032" DrawAspect="Icon" ObjectID="_1852189946" r:id="rId21"/>
         </w:object>
       </w:r>
     </w:p>
@@ -1970,6 +2026,41 @@
       <w:spacing w:val="5"/>
     </w:rPr>
   </w:style>
+  <w:style w:type="character" w:styleId="Hyperlink">
+    <w:name w:val="Hyperlink"/>
+    <w:basedOn w:val="DefaultParagraphFont"/>
+    <w:uiPriority w:val="99"/>
+    <w:unhideWhenUsed/>
+    <w:rsid w:val="002A0C48"/>
+    <w:rPr>
+      <w:color w:val="467886" w:themeColor="hyperlink"/>
+      <w:u w:val="single"/>
+    </w:rPr>
+  </w:style>
+  <w:style w:type="character" w:styleId="UnresolvedMention">
+    <w:name w:val="Unresolved Mention"/>
+    <w:basedOn w:val="DefaultParagraphFont"/>
+    <w:uiPriority w:val="99"/>
+    <w:semiHidden/>
+    <w:unhideWhenUsed/>
+    <w:rsid w:val="002A0C48"/>
+    <w:rPr>
+      <w:color w:val="605E5C"/>
+      <w:shd w:val="clear" w:color="auto" w:fill="E1DFDD"/>
+    </w:rPr>
+  </w:style>
+  <w:style w:type="character" w:styleId="FollowedHyperlink">
+    <w:name w:val="FollowedHyperlink"/>
+    <w:basedOn w:val="DefaultParagraphFont"/>
+    <w:uiPriority w:val="99"/>
+    <w:semiHidden/>
+    <w:unhideWhenUsed/>
+    <w:rsid w:val="00271763"/>
+    <w:rPr>
+      <w:color w:val="96607D" w:themeColor="followedHyperlink"/>
+      <w:u w:val="single"/>
+    </w:rPr>
+  </w:style>
 </w:styles>
 </file>
 

</xml_diff>